<commit_message>
Release 1.42.0 — saved tender conditions keep portal details, CMC SE LOA templates, Resolution AS authority, document margin/spacing fixes
Co-Authored-By: Claude Sonnet 5.5 <noreply@anthropic.com>
</commit_message>
<xml_diff>
--- a/resources/ae-dyee-forwarding-template-ghmc.docx
+++ b/resources/ae-dyee-forwarding-template-ghmc.docx
@@ -214,6 +214,30 @@
       </w:r>
       <w:r>
         <w:t>: {{Agreement No}}</w:t>
+      </w:r>
+    </w:p>
+    <w:p>
+      <w:pPr>
+        <w:spacing w:line="480" w:lineRule="auto"/>
+        <w:ind w:left="1440" w:hanging="1440"/>
+        <w:jc w:val="left"/>
+      </w:pPr>
+      <w:r>
+        <w:tab/>
+        <w:tab/>
+        <w:t xml:space="preserve">2. Administrative Sanction: E-Office File No: {{AS File No}} for an amount of Rs.{{Amount of estimate}}</w:t>
+      </w:r>
+    </w:p>
+    <w:p>
+      <w:pPr>
+        <w:spacing w:line="480" w:lineRule="auto"/>
+        <w:ind w:left="1440" w:hanging="1440"/>
+        <w:jc w:val="left"/>
+      </w:pPr>
+      <w:r>
+        <w:tab/>
+        <w:tab/>
+        <w:t xml:space="preserve">3. Technical Sanction: TS No: {{TS No}}/{{Financial year}} for an amount of Rs.{{Amount of estimate}}</w:t>
       </w:r>
     </w:p>
     <w:p>
@@ -4130,7 +4154,7 @@
                 <w:szCs w:val="20"/>
                 <w:lang w:bidi="te-IN"/>
               </w:rPr>
-              <w:t> </w:t>
+              <w:t xml:space="preserve">{{Work Order No}}</w:t>
             </w:r>
           </w:p>
         </w:tc>
@@ -4271,7 +4295,7 @@
                 <w:szCs w:val="20"/>
                 <w:lang w:bidi="te-IN"/>
               </w:rPr>
-              <w:t> </w:t>
+              <w:t xml:space="preserve">Eoffice reference number: {{AS File No}} for an estimated amount of Rs.{{Amount of estimate}}</w:t>
             </w:r>
           </w:p>
         </w:tc>
@@ -4412,13 +4436,7 @@
                 <w:szCs w:val="20"/>
                 <w:lang w:bidi="te-IN"/>
               </w:rPr>
-              <w:t> </w:t>
-            </w:r>
-            <w:r>
-              <w:rPr>
-                <w:b/>
-              </w:rPr>
-              <w:t xml:space="preserve">{{TS No and Date}}</w:t>
+              <w:t xml:space="preserve">{{TS No}}/{{Financial year}} for an amount of Rs.{{Amount of estimate}}</w:t>
             </w:r>
           </w:p>
         </w:tc>

</xml_diff>

<commit_message>
Release 1.42.1 — AE/Dy.EE forwarding letters: Ref block alignment, duplicate Rs., name-of-work indent
Co-Authored-By: Claude Sonnet 5.5 <noreply@anthropic.com>
</commit_message>
<xml_diff>
--- a/resources/ae-dyee-forwarding-template-ghmc.docx
+++ b/resources/ae-dyee-forwarding-template-ghmc.docx
@@ -201,11 +201,10 @@
     <w:p>
       <w:pPr>
         <w:spacing w:line="480" w:lineRule="auto"/>
-        <w:ind w:left="0" w:firstLine="0"/>
+        <w:ind w:left="1440" w:hanging="720"/>
         <w:jc w:val="left"/>
       </w:pPr>
       <w:r>
-        <w:tab/>
         <w:t>Ref:</w:t>
       </w:r>
       <w:r>
@@ -224,8 +223,7 @@
       </w:pPr>
       <w:r>
         <w:tab/>
-        <w:tab/>
-        <w:t xml:space="preserve">2. Administrative Sanction: E-Office File No: {{AS File No}} for an amount of Rs.{{Amount of estimate}}</w:t>
+        <w:t xml:space="preserve">2. Administrative Sanction: E-Office File No: {{AS File No}} for an amount of {{Amount of estimate}}</w:t>
       </w:r>
     </w:p>
     <w:p>
@@ -236,8 +234,7 @@
       </w:pPr>
       <w:r>
         <w:tab/>
-        <w:tab/>
-        <w:t xml:space="preserve">3. Technical Sanction: TS No: {{TS No}}/{{Financial year}} for an amount of Rs.{{Amount of estimate}}</w:t>
+        <w:t xml:space="preserve">3. Technical Sanction: TS No: {{TS No}}/{{Financial year}} for an amount of {{Amount of estimate}}</w:t>
       </w:r>
     </w:p>
     <w:p>
@@ -2353,6 +2350,8 @@
           </w:tcPr>
           <w:p>
             <w:pPr>
+              <w:ind w:left="0" w:firstLine="0"/>
+              <w:jc w:val="left"/>
               <w:rPr>
                 <w:rFonts w:ascii="Times New Roman" w:hAnsi="Times New Roman" w:cs="Times New Roman"/>
                 <w:b/>
@@ -4295,7 +4294,7 @@
                 <w:szCs w:val="20"/>
                 <w:lang w:bidi="te-IN"/>
               </w:rPr>
-              <w:t xml:space="preserve">Eoffice reference number: {{AS File No}} for an estimated amount of Rs.{{Amount of estimate}}</w:t>
+              <w:t xml:space="preserve">Eoffice reference number: {{AS File No}} for an estimated amount of {{Amount of estimate}}</w:t>
             </w:r>
           </w:p>
         </w:tc>
@@ -4436,7 +4435,7 @@
                 <w:szCs w:val="20"/>
                 <w:lang w:bidi="te-IN"/>
               </w:rPr>
-              <w:t xml:space="preserve">{{TS No}}/{{Financial year}} for an amount of Rs.{{Amount of estimate}}</w:t>
+              <w:t xml:space="preserve">{{TS No}}/{{Financial year}} for an amount of {{Amount of estimate}}</w:t>
             </w:r>
           </w:p>
         </w:tc>
@@ -7525,6 +7524,8 @@
           </w:tcPr>
           <w:p>
             <w:pPr>
+              <w:ind w:left="0" w:firstLine="0"/>
+              <w:jc w:val="left"/>
               <w:rPr>
                 <w:b/>
                 <w:sz w:val="16"/>

</xml_diff>

<commit_message>
Release 1.47.0 — Backup & Restore, activity log, QC Intimation page 4 + Work Order Ref, tender document back to 41 pages
- QC Intimation/Completion: new 4th-party page (page 4) with Work Order No and AE name & phone input; Ref quotes the Work Order; Dy.EE intimation says work is in progress
- Work Order: WIN Code unbolded, name of work bold in Subject
- Tender Document: footers restored (41 pages), GST stays blank without a technical sanction estimate
- Backup & Restore, activity log, Schedule A PDF, Chromium-based docx to PDF conversion

Co-Authored-By: Claude Sonnet 5.5 <noreply@anthropic.com>
</commit_message>
<xml_diff>
--- a/resources/ae-dyee-forwarding-template-ghmc.docx
+++ b/resources/ae-dyee-forwarding-template-ghmc.docx
@@ -158,7 +158,7 @@
         <w:ind w:left="0" w:firstLine="0"/>
       </w:pPr>
       <w:r>
-        <w:t>Sir,</w:t>
+        <w:t>Sir/Mam,</w:t>
       </w:r>
     </w:p>
     <w:p>
@@ -198,44 +198,133 @@
         <w:t>@@@</w:t>
       </w:r>
     </w:p>
+    <w:tbl>
+      <w:tblPr>
+        <w:tblW w:w="8306" w:type="dxa"/>
+        <w:tblInd w:w="720" w:type="dxa"/>
+        <w:tblBorders>
+          <w:top w:val="none" w:sz="0" w:space="0" w:color="auto"/>
+          <w:left w:val="none" w:sz="0" w:space="0" w:color="auto"/>
+          <w:bottom w:val="none" w:sz="0" w:space="0" w:color="auto"/>
+          <w:right w:val="none" w:sz="0" w:space="0" w:color="auto"/>
+          <w:insideH w:val="none" w:sz="0" w:space="0" w:color="auto"/>
+          <w:insideV w:val="none" w:sz="0" w:space="0" w:color="auto"/>
+        </w:tblBorders>
+        <w:tblLayout w:type="fixed"/>
+        <w:tblCellMar>
+          <w:left w:w="0" w:type="dxa"/>
+          <w:right w:w="60" w:type="dxa"/>
+        </w:tblCellMar>
+        <w:tblLook w:val="0000"/>
+      </w:tblPr>
+      <w:tblGrid>
+        <w:gridCol w:w="700"/>
+        <w:gridCol w:w="7606"/>
+      </w:tblGrid>
+      <w:tr>
+        <w:trPr>
+          <w:cantSplit/>
+        </w:trPr>
+        <w:tc>
+          <w:tcPr>
+            <w:tcW w:w="700" w:type="dxa"/>
+          </w:tcPr>
+          <w:p>
+            <w:pPr>
+              <w:spacing w:before="0" w:after="60" w:line="240" w:lineRule="auto"/>
+              <w:ind w:left="0" w:firstLine="0"/>
+              <w:jc w:val="left"/>
+            </w:pPr>
+            <w:r>
+              <w:t xml:space="preserve">Ref:</w:t>
+            </w:r>
+          </w:p>
+        </w:tc>
+        <w:tc>
+          <w:tcPr>
+            <w:tcW w:w="7606" w:type="dxa"/>
+          </w:tcPr>
+          <w:p>
+            <w:pPr>
+              <w:spacing w:before="0" w:after="60" w:line="240" w:lineRule="auto"/>
+              <w:ind w:left="0" w:firstLine="0"/>
+              <w:jc w:val="left"/>
+            </w:pPr>
+            <w:r>
+              <w:t xml:space="preserve">1) Agreement No: {{Agreement No}}</w:t>
+            </w:r>
+          </w:p>
+        </w:tc>
+      </w:tr>
+      <w:tr>
+        <w:trPr>
+          <w:cantSplit/>
+        </w:trPr>
+        <w:tc>
+          <w:tcPr>
+            <w:tcW w:w="700" w:type="dxa"/>
+          </w:tcPr>
+          <w:p>
+            <w:pPr>
+              <w:spacing w:before="0" w:after="60" w:line="240" w:lineRule="auto"/>
+              <w:ind w:left="0" w:firstLine="0"/>
+              <w:jc w:val="left"/>
+            </w:pPr>
+          </w:p>
+        </w:tc>
+        <w:tc>
+          <w:tcPr>
+            <w:tcW w:w="7606" w:type="dxa"/>
+          </w:tcPr>
+          <w:p>
+            <w:pPr>
+              <w:spacing w:before="0" w:after="60" w:line="240" w:lineRule="auto"/>
+              <w:ind w:left="0" w:firstLine="0"/>
+              <w:jc w:val="left"/>
+            </w:pPr>
+            <w:r>
+              <w:t xml:space="preserve">2) Administrative Sanction: E-Office File No: {{AS File No}}, for an amount of {{Amount of estimate}}</w:t>
+            </w:r>
+          </w:p>
+        </w:tc>
+      </w:tr>
+      <w:tr>
+        <w:trPr>
+          <w:cantSplit/>
+        </w:trPr>
+        <w:tc>
+          <w:tcPr>
+            <w:tcW w:w="700" w:type="dxa"/>
+          </w:tcPr>
+          <w:p>
+            <w:pPr>
+              <w:spacing w:before="0" w:after="60" w:line="240" w:lineRule="auto"/>
+              <w:ind w:left="0" w:firstLine="0"/>
+              <w:jc w:val="left"/>
+            </w:pPr>
+          </w:p>
+        </w:tc>
+        <w:tc>
+          <w:tcPr>
+            <w:tcW w:w="7606" w:type="dxa"/>
+          </w:tcPr>
+          <w:p>
+            <w:pPr>
+              <w:spacing w:before="0" w:after="60" w:line="240" w:lineRule="auto"/>
+              <w:ind w:left="0" w:firstLine="0"/>
+              <w:jc w:val="left"/>
+            </w:pPr>
+            <w:r>
+              <w:t xml:space="preserve">3) Technical Sanction: TS No: {{TS Ref}}, for an amount of {{Amount of estimate}}</w:t>
+            </w:r>
+          </w:p>
+        </w:tc>
+      </w:tr>
+    </w:tbl>
     <w:p>
       <w:pPr>
-        <w:spacing w:line="480" w:lineRule="auto"/>
-        <w:ind w:left="1440" w:hanging="720"/>
-        <w:jc w:val="left"/>
+        <w:spacing w:after="0" w:line="120" w:lineRule="exact"/>
       </w:pPr>
-      <w:r>
-        <w:t>Ref:</w:t>
-      </w:r>
-      <w:r>
-        <w:tab/>
-        <w:t>1. Agreement no</w:t>
-      </w:r>
-      <w:r>
-        <w:t>: {{Agreement No}}</w:t>
-      </w:r>
-    </w:p>
-    <w:p>
-      <w:pPr>
-        <w:spacing w:line="480" w:lineRule="auto"/>
-        <w:ind w:left="1440" w:hanging="1440"/>
-        <w:jc w:val="left"/>
-      </w:pPr>
-      <w:r>
-        <w:tab/>
-        <w:t xml:space="preserve">2. Administrative Sanction: E-Office File No: {{AS File No}} for an amount of {{Amount of estimate}}</w:t>
-      </w:r>
-    </w:p>
-    <w:p>
-      <w:pPr>
-        <w:spacing w:line="480" w:lineRule="auto"/>
-        <w:ind w:left="1440" w:hanging="1440"/>
-        <w:jc w:val="left"/>
-      </w:pPr>
-      <w:r>
-        <w:tab/>
-        <w:t xml:space="preserve">3. Technical Sanction: TS No: {{TS No}}/{{Financial year}} for an amount of {{Amount of estimate}}</w:t>
-      </w:r>
     </w:p>
     <w:p>
       <w:pPr>
@@ -316,6 +405,12 @@
       <w:r>
         <w:t>Yours faithfully,</w:t>
       </w:r>
+    </w:p>
+    <w:p>
+      <w:pPr>
+        <w:spacing w:line="360" w:lineRule="auto"/>
+        <w:ind w:left="7200" w:firstLine="0"/>
+      </w:pPr>
     </w:p>
     <w:p>
       <w:pPr>
@@ -1895,6 +1990,30 @@
           <w:p>
             <w:pPr>
               <w:ind w:left="0" w:firstLine="0"/>
+              <w:rPr>
+                <w:rFonts w:ascii="Arial" w:hAnsi="Arial" w:cs="Arial"/>
+                <w:b/>
+                <w:bCs/>
+                <w:sz w:val="16"/>
+                <w:szCs w:val="16"/>
+              </w:rPr>
+            </w:pPr>
+          </w:p>
+          <w:p>
+            <w:pPr>
+              <w:ind w:left="0" w:firstLine="0"/>
+              <w:rPr>
+                <w:rFonts w:ascii="Arial" w:hAnsi="Arial" w:cs="Arial"/>
+                <w:b/>
+                <w:bCs/>
+                <w:sz w:val="16"/>
+                <w:szCs w:val="16"/>
+              </w:rPr>
+            </w:pPr>
+          </w:p>
+          <w:p>
+            <w:pPr>
+              <w:ind w:left="0" w:firstLine="0"/>
               <w:jc w:val="center"/>
               <w:rPr>
                 <w:rFonts w:ascii="Arial" w:hAnsi="Arial" w:cs="Arial"/>
@@ -3315,6 +3434,16 @@
     </w:p>
     <w:p>
       <w:pPr>
+        <w:spacing w:before="0" w:after="0" w:line="240" w:lineRule="auto"/>
+      </w:pPr>
+    </w:p>
+    <w:p>
+      <w:pPr>
+        <w:spacing w:before="0" w:after="0" w:line="240" w:lineRule="auto"/>
+      </w:pPr>
+    </w:p>
+    <w:p>
+      <w:pPr>
         <w:ind w:left="7200" w:firstLine="0"/>
         <w:jc w:val="center"/>
         <w:rPr>
@@ -4012,7 +4141,7 @@
                 <w:szCs w:val="20"/>
                 <w:lang w:bidi="te-IN"/>
               </w:rPr>
-              <w:t> </w:t>
+              <w:t xml:space="preserve">{{Budget No}}</w:t>
             </w:r>
           </w:p>
         </w:tc>
@@ -4435,7 +4564,7 @@
                 <w:szCs w:val="20"/>
                 <w:lang w:bidi="te-IN"/>
               </w:rPr>
-              <w:t xml:space="preserve">{{TS No}}/{{Financial year}} for an amount of {{Amount of estimate}}</w:t>
+              <w:t xml:space="preserve">{{TS Ref}} for an amount of {{Amount of estimate}}</w:t>
             </w:r>
           </w:p>
         </w:tc>
@@ -5014,20 +5143,9 @@
             </w:pPr>
             <w:r>
               <w:rPr>
-                <w:rFonts w:ascii="Arial" w:eastAsia="Times New Roman" w:hAnsi="Arial" w:cs="Arial"/>
-                <w:b/>
-                <w:bCs/>
-                <w:sz w:val="20"/>
-                <w:szCs w:val="20"/>
-                <w:lang w:bidi="te-IN"/>
-              </w:rPr>
-              <w:t> </w:t>
-            </w:r>
-            <w:r>
-              <w:rPr>
-                <w:b/>
-              </w:rPr>
-              <w:t xml:space="preserve">{{Agmt Date}}</w:t>
+                <w:b/>
+              </w:rPr>
+              <w:t xml:space="preserve">{{Agreement No and Date}}</w:t>
             </w:r>
           </w:p>
         </w:tc>
@@ -7023,6 +7141,19 @@
           <w:p>
             <w:pPr>
               <w:ind w:left="0" w:firstLine="0"/>
+              <w:rPr>
+                <w:rFonts w:ascii="Arial" w:eastAsia="Times New Roman" w:hAnsi="Arial" w:cs="Arial"/>
+                <w:b/>
+                <w:bCs/>
+                <w:sz w:val="20"/>
+                <w:szCs w:val="20"/>
+                <w:lang w:bidi="te-IN"/>
+              </w:rPr>
+            </w:pPr>
+          </w:p>
+          <w:p>
+            <w:pPr>
+              <w:ind w:left="0" w:firstLine="0"/>
               <w:jc w:val="left"/>
               <w:rPr>
                 <w:rFonts w:ascii="Arial" w:eastAsia="Times New Roman" w:hAnsi="Arial" w:cs="Arial"/>
@@ -7083,6 +7214,19 @@
             <w:vAlign w:val="center"/>
             <w:hideMark/>
           </w:tcPr>
+          <w:p>
+            <w:pPr>
+              <w:ind w:left="0" w:firstLine="0"/>
+              <w:rPr>
+                <w:rFonts w:ascii="Arial" w:eastAsia="Times New Roman" w:hAnsi="Arial" w:cs="Arial"/>
+                <w:b/>
+                <w:bCs/>
+                <w:sz w:val="20"/>
+                <w:szCs w:val="20"/>
+                <w:lang w:bidi="te-IN"/>
+              </w:rPr>
+            </w:pPr>
+          </w:p>
           <w:p>
             <w:pPr>
               <w:ind w:left="0" w:firstLine="0"/>
@@ -7294,7 +7438,7 @@
         </w:rPr>
         <w:sectPr>
           <w:pgSz w:w="12240" w:h="15840"/>
-          <w:pgMar w:top="452" w:right="720" w:bottom="142" w:left="720" w:header="720" w:footer="720" w:gutter="0"/>
+          <w:pgMar w:top="452" w:right="720" w:bottom="0" w:left="720" w:header="720" w:footer="0" w:gutter="0"/>
           <w:cols w:space="720"/>
           <w:docGrid w:linePitch="360"/>
         </w:sectPr>

</xml_diff>